<commit_message>
completed Week 5 Exit Ticket
</commit_message>
<xml_diff>
--- a/quizzes_exit_tickets/Week05_ExitTicket.docx
+++ b/quizzes_exit_tickets/Week05_ExitTicket.docx
@@ -96,7 +96,15 @@
     </w:p>
     <w:p>
       <w:r>
-        <w:t>2. Why can a Type II FIR never be a conventional high-pass with non-zero Nyquist gain?</w:t>
+        <w:t xml:space="preserve">2. Why can a Type II FIR never be a conventional </w:t>
+      </w:r>
+      <w:proofErr w:type="gramStart"/>
+      <w:r>
+        <w:t>high-pass</w:t>
+      </w:r>
+      <w:proofErr w:type="gramEnd"/>
+      <w:r>
+        <w:t xml:space="preserve"> with non-zero Nyquist gain?</w:t>
       </w:r>
     </w:p>
     <w:p/>
@@ -301,7 +309,59 @@
         <w:rPr>
           <w:rFonts w:eastAsiaTheme="minorEastAsia"/>
         </w:rPr>
-        <w:t>, thereby producing a larger group-delay value.</w:t>
+        <w:t xml:space="preserve">, thereby </w:t>
+      </w:r>
+      <w:r>
+        <w:rPr>
+          <w:rFonts w:eastAsiaTheme="minorEastAsia"/>
+        </w:rPr>
+        <w:t xml:space="preserve">increasing the </w:t>
+      </w:r>
+      <w:r>
+        <w:rPr>
+          <w:rFonts w:eastAsiaTheme="minorEastAsia"/>
+        </w:rPr>
+        <w:t>group-delay value</w:t>
+      </w:r>
+      <w:r>
+        <w:rPr>
+          <w:rFonts w:eastAsiaTheme="minorEastAsia"/>
+        </w:rPr>
+        <w:t xml:space="preserve"> near </w:t>
+      </w:r>
+      <m:oMath>
+        <m:sSub>
+          <m:sSubPr>
+            <m:ctrlPr>
+              <w:rPr>
+                <w:rFonts w:ascii="Cambria Math" w:eastAsiaTheme="minorEastAsia" w:hAnsi="Cambria Math"/>
+                <w:i/>
+              </w:rPr>
+            </m:ctrlPr>
+          </m:sSubPr>
+          <m:e>
+            <m:r>
+              <w:rPr>
+                <w:rFonts w:ascii="Cambria Math" w:eastAsiaTheme="minorEastAsia" w:hAnsi="Cambria Math"/>
+              </w:rPr>
+              <m:t>ω</m:t>
+            </m:r>
+          </m:e>
+          <m:sub>
+            <m:r>
+              <w:rPr>
+                <w:rFonts w:ascii="Cambria Math" w:eastAsiaTheme="minorEastAsia" w:hAnsi="Cambria Math"/>
+              </w:rPr>
+              <m:t>0</m:t>
+            </m:r>
+          </m:sub>
+        </m:sSub>
+      </m:oMath>
+      <w:r>
+        <w:rPr>
+          <w:rFonts w:eastAsiaTheme="minorEastAsia"/>
+        </w:rPr>
+        <w:t>.</w:t>
       </w:r>
     </w:p>
     <w:p>
@@ -367,56 +427,320 @@
         <w:rPr>
           <w:rFonts w:eastAsiaTheme="minorEastAsia"/>
         </w:rPr>
-        <w:t>. A conventional high-pass requires non-zero gain at Nyquist, so the requirements conflict.</w:t>
+        <w:t xml:space="preserve">. A conventional </w:t>
+      </w:r>
+      <w:proofErr w:type="gramStart"/>
+      <w:r>
+        <w:rPr>
+          <w:rFonts w:eastAsiaTheme="minorEastAsia"/>
+        </w:rPr>
+        <w:t>high-pass</w:t>
+      </w:r>
+      <w:proofErr w:type="gramEnd"/>
+      <w:r>
+        <w:rPr>
+          <w:rFonts w:eastAsiaTheme="minorEastAsia"/>
+        </w:rPr>
+        <w:t xml:space="preserve"> requires non-zero gain at Nyquist, so the requirements conflict.</w:t>
+      </w:r>
+      <w:r>
+        <w:rPr>
+          <w:rFonts w:eastAsiaTheme="minorEastAsia"/>
+        </w:rPr>
+        <w:t xml:space="preserve"> The structural constraint is imposed because </w:t>
+      </w:r>
+      <m:oMath>
+        <m:r>
+          <w:rPr>
+            <w:rFonts w:ascii="Cambria Math" w:eastAsiaTheme="minorEastAsia" w:hAnsi="Cambria Math"/>
+          </w:rPr>
+          <m:t>h</m:t>
+        </m:r>
+        <m:d>
+          <m:dPr>
+            <m:begChr m:val="["/>
+            <m:endChr m:val="]"/>
+            <m:ctrlPr>
+              <w:rPr>
+                <w:rFonts w:ascii="Cambria Math" w:eastAsiaTheme="minorEastAsia" w:hAnsi="Cambria Math"/>
+                <w:i/>
+              </w:rPr>
+            </m:ctrlPr>
+          </m:dPr>
+          <m:e>
+            <m:r>
+              <w:rPr>
+                <w:rFonts w:ascii="Cambria Math" w:eastAsiaTheme="minorEastAsia" w:hAnsi="Cambria Math"/>
+              </w:rPr>
+              <m:t>n</m:t>
+            </m:r>
+          </m:e>
+        </m:d>
+        <m:r>
+          <w:rPr>
+            <w:rFonts w:ascii="Cambria Math" w:eastAsiaTheme="minorEastAsia" w:hAnsi="Cambria Math"/>
+          </w:rPr>
+          <m:t>=h[M-n]</m:t>
+        </m:r>
+      </m:oMath>
+      <w:r>
+        <w:rPr>
+          <w:rFonts w:eastAsiaTheme="minorEastAsia"/>
+        </w:rPr>
+        <w:t xml:space="preserve"> translates to </w:t>
+      </w:r>
+      <m:oMath>
+        <m:r>
+          <w:rPr>
+            <w:rFonts w:ascii="Cambria Math" w:eastAsiaTheme="minorEastAsia" w:hAnsi="Cambria Math"/>
+          </w:rPr>
+          <m:t>H</m:t>
+        </m:r>
+        <m:d>
+          <m:dPr>
+            <m:ctrlPr>
+              <w:rPr>
+                <w:rFonts w:ascii="Cambria Math" w:eastAsiaTheme="minorEastAsia" w:hAnsi="Cambria Math"/>
+                <w:i/>
+              </w:rPr>
+            </m:ctrlPr>
+          </m:dPr>
+          <m:e>
+            <m:r>
+              <w:rPr>
+                <w:rFonts w:ascii="Cambria Math" w:eastAsiaTheme="minorEastAsia" w:hAnsi="Cambria Math"/>
+              </w:rPr>
+              <m:t>z</m:t>
+            </m:r>
+          </m:e>
+        </m:d>
+        <m:r>
+          <w:rPr>
+            <w:rFonts w:ascii="Cambria Math" w:eastAsiaTheme="minorEastAsia" w:hAnsi="Cambria Math"/>
+          </w:rPr>
+          <m:t>=</m:t>
+        </m:r>
+        <m:sSup>
+          <m:sSupPr>
+            <m:ctrlPr>
+              <w:rPr>
+                <w:rFonts w:ascii="Cambria Math" w:eastAsiaTheme="minorEastAsia" w:hAnsi="Cambria Math"/>
+                <w:i/>
+              </w:rPr>
+            </m:ctrlPr>
+          </m:sSupPr>
+          <m:e>
+            <m:r>
+              <w:rPr>
+                <w:rFonts w:ascii="Cambria Math" w:eastAsiaTheme="minorEastAsia" w:hAnsi="Cambria Math"/>
+              </w:rPr>
+              <m:t>z</m:t>
+            </m:r>
+          </m:e>
+          <m:sup>
+            <m:r>
+              <w:rPr>
+                <w:rFonts w:ascii="Cambria Math" w:eastAsiaTheme="minorEastAsia" w:hAnsi="Cambria Math"/>
+              </w:rPr>
+              <m:t>-M</m:t>
+            </m:r>
+          </m:sup>
+        </m:sSup>
+        <m:r>
+          <w:rPr>
+            <w:rFonts w:ascii="Cambria Math" w:eastAsiaTheme="minorEastAsia" w:hAnsi="Cambria Math"/>
+          </w:rPr>
+          <m:t>H(</m:t>
+        </m:r>
+        <m:sSup>
+          <m:sSupPr>
+            <m:ctrlPr>
+              <w:rPr>
+                <w:rFonts w:ascii="Cambria Math" w:eastAsiaTheme="minorEastAsia" w:hAnsi="Cambria Math"/>
+                <w:i/>
+              </w:rPr>
+            </m:ctrlPr>
+          </m:sSupPr>
+          <m:e>
+            <m:r>
+              <w:rPr>
+                <w:rFonts w:ascii="Cambria Math" w:eastAsiaTheme="minorEastAsia" w:hAnsi="Cambria Math"/>
+              </w:rPr>
+              <m:t>z</m:t>
+            </m:r>
+          </m:e>
+          <m:sup>
+            <m:r>
+              <w:rPr>
+                <w:rFonts w:ascii="Cambria Math" w:eastAsiaTheme="minorEastAsia" w:hAnsi="Cambria Math"/>
+              </w:rPr>
+              <m:t>-1</m:t>
+            </m:r>
+          </m:sup>
+        </m:sSup>
+        <m:r>
+          <w:rPr>
+            <w:rFonts w:ascii="Cambria Math" w:eastAsiaTheme="minorEastAsia" w:hAnsi="Cambria Math"/>
+          </w:rPr>
+          <m:t>)</m:t>
+        </m:r>
+      </m:oMath>
+      <w:r>
+        <w:rPr>
+          <w:rFonts w:eastAsiaTheme="minorEastAsia"/>
+        </w:rPr>
+        <w:t xml:space="preserve"> in the </w:t>
+      </w:r>
+      <m:oMath>
+        <m:r>
+          <w:rPr>
+            <w:rFonts w:ascii="Cambria Math" w:eastAsiaTheme="minorEastAsia" w:hAnsi="Cambria Math"/>
+          </w:rPr>
+          <m:t>z</m:t>
+        </m:r>
+      </m:oMath>
+      <w:r>
+        <w:rPr>
+          <w:rFonts w:eastAsiaTheme="minorEastAsia"/>
+        </w:rPr>
+        <w:t xml:space="preserve">-domain and for odd </w:t>
+      </w:r>
+      <m:oMath>
+        <m:r>
+          <w:rPr>
+            <w:rFonts w:ascii="Cambria Math" w:eastAsiaTheme="minorEastAsia" w:hAnsi="Cambria Math"/>
+          </w:rPr>
+          <m:t>M</m:t>
+        </m:r>
+      </m:oMath>
+      <w:r>
+        <w:rPr>
+          <w:rFonts w:eastAsiaTheme="minorEastAsia"/>
+        </w:rPr>
+        <w:t xml:space="preserve"> </w:t>
+      </w:r>
+      <m:oMath>
+        <m:r>
+          <w:rPr>
+            <w:rFonts w:ascii="Cambria Math" w:eastAsiaTheme="minorEastAsia" w:hAnsi="Cambria Math"/>
+          </w:rPr>
+          <m:t>H</m:t>
+        </m:r>
+        <m:d>
+          <m:dPr>
+            <m:ctrlPr>
+              <w:rPr>
+                <w:rFonts w:ascii="Cambria Math" w:eastAsiaTheme="minorEastAsia" w:hAnsi="Cambria Math"/>
+                <w:i/>
+              </w:rPr>
+            </m:ctrlPr>
+          </m:dPr>
+          <m:e>
+            <m:r>
+              <w:rPr>
+                <w:rFonts w:ascii="Cambria Math" w:eastAsiaTheme="minorEastAsia" w:hAnsi="Cambria Math"/>
+              </w:rPr>
+              <m:t>-1</m:t>
+            </m:r>
+          </m:e>
+        </m:d>
+        <m:r>
+          <w:rPr>
+            <w:rFonts w:ascii="Cambria Math" w:eastAsiaTheme="minorEastAsia" w:hAnsi="Cambria Math"/>
+          </w:rPr>
+          <m:t>=</m:t>
+        </m:r>
+        <m:sSup>
+          <m:sSupPr>
+            <m:ctrlPr>
+              <w:rPr>
+                <w:rFonts w:ascii="Cambria Math" w:eastAsiaTheme="minorEastAsia" w:hAnsi="Cambria Math"/>
+                <w:i/>
+              </w:rPr>
+            </m:ctrlPr>
+          </m:sSupPr>
+          <m:e>
+            <m:d>
+              <m:dPr>
+                <m:ctrlPr>
+                  <w:rPr>
+                    <w:rFonts w:ascii="Cambria Math" w:eastAsiaTheme="minorEastAsia" w:hAnsi="Cambria Math"/>
+                    <w:i/>
+                  </w:rPr>
+                </m:ctrlPr>
+              </m:dPr>
+              <m:e>
+                <m:r>
+                  <w:rPr>
+                    <w:rFonts w:ascii="Cambria Math" w:eastAsiaTheme="minorEastAsia" w:hAnsi="Cambria Math"/>
+                  </w:rPr>
+                  <m:t>-1</m:t>
+                </m:r>
+              </m:e>
+            </m:d>
+          </m:e>
+          <m:sup>
+            <m:r>
+              <w:rPr>
+                <w:rFonts w:ascii="Cambria Math" w:eastAsiaTheme="minorEastAsia" w:hAnsi="Cambria Math"/>
+              </w:rPr>
+              <m:t>M</m:t>
+            </m:r>
+          </m:sup>
+        </m:sSup>
+        <m:r>
+          <w:rPr>
+            <w:rFonts w:ascii="Cambria Math" w:eastAsiaTheme="minorEastAsia" w:hAnsi="Cambria Math"/>
+          </w:rPr>
+          <m:t>H(-1)</m:t>
+        </m:r>
+      </m:oMath>
+      <w:r>
+        <w:rPr>
+          <w:rFonts w:eastAsiaTheme="minorEastAsia"/>
+        </w:rPr>
+        <w:t xml:space="preserve"> can only be satisfied by </w:t>
+      </w:r>
+      <m:oMath>
+        <m:r>
+          <w:rPr>
+            <w:rFonts w:ascii="Cambria Math" w:eastAsiaTheme="minorEastAsia" w:hAnsi="Cambria Math"/>
+          </w:rPr>
+          <m:t>H</m:t>
+        </m:r>
+        <m:d>
+          <m:dPr>
+            <m:ctrlPr>
+              <w:rPr>
+                <w:rFonts w:ascii="Cambria Math" w:eastAsiaTheme="minorEastAsia" w:hAnsi="Cambria Math"/>
+                <w:i/>
+              </w:rPr>
+            </m:ctrlPr>
+          </m:dPr>
+          <m:e>
+            <m:r>
+              <w:rPr>
+                <w:rFonts w:ascii="Cambria Math" w:eastAsiaTheme="minorEastAsia" w:hAnsi="Cambria Math"/>
+              </w:rPr>
+              <m:t>-1</m:t>
+            </m:r>
+          </m:e>
+        </m:d>
+        <m:r>
+          <w:rPr>
+            <w:rFonts w:ascii="Cambria Math" w:eastAsiaTheme="minorEastAsia" w:hAnsi="Cambria Math"/>
+          </w:rPr>
+          <m:t>=0</m:t>
+        </m:r>
+      </m:oMath>
+      <w:r>
+        <w:rPr>
+          <w:rFonts w:eastAsiaTheme="minorEastAsia"/>
+        </w:rPr>
+        <w:t>.</w:t>
       </w:r>
     </w:p>
     <w:p/>
-    <w:p>
-      <w:r>
-        <w:t>1.</w:t>
-      </w:r>
-      <w:r>
-        <w:t xml:space="preserve"> Symmetric means h[n]=h[N-1-n]. Shift left by (N-1)/2 to obtain a[n]=h[n+(N-1)/2]=h[(N-1)/2-n]=a[-n]. Because of the symmetry of a[n], its DTFT A(e^jw) must be real-valued and thus H(e^jw)=A(e^jw)*e^-jw(N-1)/2. The group delay is the negative derivative of the phase  -w(N-1)/2 wrt w and is thus the constant (N-1)/2.</w:t>
-      </w:r>
-    </w:p>
-    <w:p>
-      <w:r>
-        <w:t>Shifting the center of symmetric FIR filter</w:t>
-      </w:r>
-      <w:r>
-        <w:t xml:space="preserve"> to n=0 creates an impulse response with even symmetry. Its DTFT must be real-valued and thus the only phase comes from shifting the impulse response. This phase is linear in w and its derivative is thus a constant, resulting in a constant group delay.</w:t>
-      </w:r>
-    </w:p>
-    <w:p>
-      <w:r>
-        <w:t>Look for</w:t>
-      </w:r>
-      <w:r>
-        <w:t xml:space="preserve"> </w:t>
-      </w:r>
-      <w:r>
-        <w:t>shifting center to zero, creating symmetric impulse response whose DTFT must be real-valued.</w:t>
-      </w:r>
-    </w:p>
-    <w:p>
-      <w:r>
-        <w:t xml:space="preserve">2. </w:t>
-      </w:r>
-      <w:r>
-        <w:t>If Re{s}&lt;0, then t</w:t>
-      </w:r>
-      <w:r>
-        <w:t>he inverse bilinear map</w:t>
-      </w:r>
-      <w:r>
-        <w:t xml:space="preserve"> has a numerator with smaller magnitude than the denominator and thus |z|&lt;1 and the left-half s-plane maps into the unit circle in the z-plane.</w:t>
-      </w:r>
-    </w:p>
-    <w:p>
-      <w:r>
-        <w:t>Look for Re{s}&lt;0 as the criterion for |z|&lt;1 and the use of the inverse bilinear transform.</w:t>
-      </w:r>
-    </w:p>
     <w:p/>
     <w:p>
       <w:pPr>
@@ -428,80 +752,7 @@
         <w:rPr>
           <w:rFonts w:eastAsiaTheme="minorEastAsia"/>
         </w:rPr>
-        <w:lastRenderedPageBreak/>
-        <w:t>A good exit ticket answer should be short, correct</w:t>
-      </w:r>
-      <w:r>
-        <w:rPr>
-          <w:rFonts w:eastAsiaTheme="minorEastAsia"/>
-        </w:rPr>
-        <w:t>, mathematically sound</w:t>
-      </w:r>
-      <w:r>
-        <w:rPr>
-          <w:rFonts w:eastAsiaTheme="minorEastAsia"/>
-        </w:rPr>
-        <w:t>, to the point and demonstrate a well-reasoned understanding of the</w:t>
-      </w:r>
-      <w:r>
-        <w:rPr>
-          <w:rFonts w:eastAsiaTheme="minorEastAsia"/>
-        </w:rPr>
-        <w:t xml:space="preserve"> subject that the</w:t>
-      </w:r>
-      <w:r>
-        <w:rPr>
-          <w:rFonts w:eastAsiaTheme="minorEastAsia"/>
-        </w:rPr>
-        <w:t xml:space="preserve"> question </w:t>
-      </w:r>
-      <w:r>
-        <w:rPr>
-          <w:rFonts w:eastAsiaTheme="minorEastAsia"/>
-        </w:rPr>
-        <w:t>is asking about</w:t>
-      </w:r>
-      <w:r>
-        <w:rPr>
-          <w:rFonts w:eastAsiaTheme="minorEastAsia"/>
-        </w:rPr>
-        <w:t xml:space="preserve">. Exit ticket answers will be graded </w:t>
-      </w:r>
-      <w:r>
-        <w:rPr>
-          <w:rFonts w:eastAsiaTheme="minorEastAsia"/>
-        </w:rPr>
-        <w:t xml:space="preserve">on a scale of </w:t>
-      </w:r>
-      <w:r>
-        <w:rPr>
-          <w:rFonts w:eastAsiaTheme="minorEastAsia"/>
-        </w:rPr>
-        <w:t>“</w:t>
-      </w:r>
-      <w:r>
-        <w:rPr>
-          <w:rFonts w:eastAsiaTheme="minorEastAsia"/>
-        </w:rPr>
-        <w:t>low</w:t>
-      </w:r>
-      <w:r>
-        <w:rPr>
-          <w:rFonts w:eastAsiaTheme="minorEastAsia"/>
-        </w:rPr>
-        <w:t>”</w:t>
-      </w:r>
-      <w:r>
-        <w:rPr>
-          <w:rFonts w:eastAsiaTheme="minorEastAsia"/>
-        </w:rPr>
-        <w:t xml:space="preserve"> (1 point)</w:t>
-      </w:r>
-      <w:r>
-        <w:rPr>
-          <w:rFonts w:eastAsiaTheme="minorEastAsia"/>
-        </w:rPr>
-        <w:t>, “medium” (2 points), or “high” (3 points).</w:t>
+        <w:t>A good exit ticket answer should be short, correct, mathematically sound, to the point and demonstrate a well-reasoned understanding of the subject that the question is asking about. Exit ticket answers will be graded on a scale of “low” (1 point), “medium” (2 points), or “high” (3 points).</w:t>
       </w:r>
     </w:p>
     <w:p>
@@ -512,6 +763,7 @@
         <w:t>, or use the math equations in the rich content editor in Canvas.</w:t>
       </w:r>
     </w:p>
+    <w:p/>
     <w:sectPr>
       <w:pgSz w:w="12240" w:h="15840"/>
       <w:pgMar w:top="1440" w:right="1440" w:bottom="1440" w:left="1440" w:header="720" w:footer="720" w:gutter="0"/>

</xml_diff>

<commit_message>
added downsampling example for Lecture 13
</commit_message>
<xml_diff>
--- a/quizzes_exit_tickets/Week05_ExitTicket.docx
+++ b/quizzes_exit_tickets/Week05_ExitTicket.docx
@@ -372,50 +372,78 @@
         <w:t xml:space="preserve">2. Type II symmetry structurally forces </w:t>
       </w:r>
       <m:oMath>
-        <m:r>
-          <w:rPr>
-            <w:rFonts w:ascii="Cambria Math" w:eastAsiaTheme="minorEastAsia" w:hAnsi="Cambria Math"/>
-          </w:rPr>
-          <m:t>H</m:t>
-        </m:r>
-        <m:d>
-          <m:dPr>
+        <m:sSub>
+          <m:sSubPr>
             <m:ctrlPr>
               <w:rPr>
                 <w:rFonts w:ascii="Cambria Math" w:eastAsiaTheme="minorEastAsia" w:hAnsi="Cambria Math"/>
                 <w:i/>
               </w:rPr>
             </m:ctrlPr>
-          </m:dPr>
+          </m:sSubPr>
           <m:e>
-            <m:sSup>
-              <m:sSupPr>
+            <m:d>
+              <m:dPr>
+                <m:begChr m:val=""/>
+                <m:endChr m:val="|"/>
                 <m:ctrlPr>
                   <w:rPr>
                     <w:rFonts w:ascii="Cambria Math" w:eastAsiaTheme="minorEastAsia" w:hAnsi="Cambria Math"/>
                     <w:i/>
                   </w:rPr>
                 </m:ctrlPr>
-              </m:sSupPr>
+              </m:dPr>
               <m:e>
                 <m:r>
                   <w:rPr>
                     <w:rFonts w:ascii="Cambria Math" w:eastAsiaTheme="minorEastAsia" w:hAnsi="Cambria Math"/>
                   </w:rPr>
-                  <m:t>e</m:t>
+                  <m:t>H(</m:t>
                 </m:r>
-              </m:e>
-              <m:sup>
+                <m:sSup>
+                  <m:sSupPr>
+                    <m:ctrlPr>
+                      <w:rPr>
+                        <w:rFonts w:ascii="Cambria Math" w:eastAsiaTheme="minorEastAsia" w:hAnsi="Cambria Math"/>
+                        <w:i/>
+                      </w:rPr>
+                    </m:ctrlPr>
+                  </m:sSupPr>
+                  <m:e>
+                    <m:r>
+                      <w:rPr>
+                        <w:rFonts w:ascii="Cambria Math" w:eastAsiaTheme="minorEastAsia" w:hAnsi="Cambria Math"/>
+                      </w:rPr>
+                      <m:t>e</m:t>
+                    </m:r>
+                  </m:e>
+                  <m:sup>
+                    <m:r>
+                      <w:rPr>
+                        <w:rFonts w:ascii="Cambria Math" w:eastAsiaTheme="minorEastAsia" w:hAnsi="Cambria Math"/>
+                      </w:rPr>
+                      <m:t>jω</m:t>
+                    </m:r>
+                  </m:sup>
+                </m:sSup>
                 <m:r>
                   <w:rPr>
                     <w:rFonts w:ascii="Cambria Math" w:eastAsiaTheme="minorEastAsia" w:hAnsi="Cambria Math"/>
                   </w:rPr>
-                  <m:t>jω</m:t>
+                  <m:t>)</m:t>
                 </m:r>
-              </m:sup>
-            </m:sSup>
+              </m:e>
+            </m:d>
           </m:e>
-        </m:d>
+          <m:sub>
+            <m:r>
+              <w:rPr>
+                <w:rFonts w:ascii="Cambria Math" w:eastAsiaTheme="minorEastAsia" w:hAnsi="Cambria Math"/>
+              </w:rPr>
+              <m:t>ω=π</m:t>
+            </m:r>
+          </m:sub>
+        </m:sSub>
         <m:r>
           <w:rPr>
             <w:rFonts w:ascii="Cambria Math" w:eastAsiaTheme="minorEastAsia" w:hAnsi="Cambria Math"/>

</xml_diff>